<commit_message>
docs: one-click installer guide link and updated setup assets
</commit_message>
<xml_diff>
--- a/plugin/INSTALL.docx
+++ b/plugin/INSTALL.docx
@@ -4,7 +4,7 @@
   <w:body>
     <w:p>
       <w:pPr>
-        <w:spacing w:before="0" w:after="120"/>
+        <w:spacing w:after="80"/>
       </w:pPr>
       <w:r>
         <w:rPr>
@@ -18,16 +18,16 @@
     </w:p>
     <w:p>
       <w:pPr>
-        <w:spacing w:before="0" w:after="80"/>
+        <w:spacing w:after="80"/>
       </w:pPr>
       <w:r>
         <w:rPr>
           <w:rFonts w:ascii="微软雅黑" w:hAnsi="微软雅黑" w:eastAsia="微软雅黑"/>
           <w:b/>
           <w:color w:val="1E2433"/>
-          <w:sz w:val="44"/>
+          <w:sz w:val="40"/>
         </w:rPr>
-        <w:t>安装指南</w:t>
+        <w:t>一键安装指南</w:t>
       </w:r>
     </w:p>
     <w:p>
@@ -41,7 +41,7 @@
           <w:color w:val="6B7280"/>
           <w:sz w:val="21"/>
         </w:rPr>
-        <w:t>适用版本：0.6.9　｜　5 步完成　｜　约 5 分钟</w:t>
+        <w:t>适用版本：0.6.26　｜　约 2 分钟</w:t>
       </w:r>
     </w:p>
     <w:p>
@@ -54,7 +54,7 @@
           <w:b w:val="0"/>
           <w:sz w:val="21"/>
         </w:rPr>
-        <w:t>安装包已包含页面、工具、Word 模板、Python 渲染脚本和配套 Skill。正常安装不需要执行 npm install，也不需要手工复制 Skill。</w:t>
+        <w:t>安装器会自动完成插件解压、DSH bundle 登记、本地依赖建立和 GO秘 配置写入。不需要 npm，也不需要手工编辑 YAML。</w:t>
       </w:r>
     </w:p>
     <w:p>
@@ -65,7 +65,7 @@
       <w:r>
         <w:drawing>
           <wp:inline xmlns:a="http://schemas.openxmlformats.org/drawingml/2006/main" xmlns:pic="http://schemas.openxmlformats.org/drawingml/2006/picture">
-            <wp:extent cx="5940000" cy="3638250"/>
+            <wp:extent cx="5940000" cy="3341250"/>
             <wp:docPr id="1" name="Picture 1"/>
             <wp:cNvGraphicFramePr>
               <a:graphicFrameLocks noChangeAspect="1"/>
@@ -74,7 +74,7 @@
               <a:graphicData uri="http://schemas.openxmlformats.org/drawingml/2006/picture">
                 <pic:pic>
                   <pic:nvPicPr>
-                    <pic:cNvPr id="0" name="install-flow.png"/>
+                    <pic:cNvPr id="0" name="install-oneclick.png"/>
                     <pic:cNvPicPr/>
                   </pic:nvPicPr>
                   <pic:blipFill>
@@ -86,7 +86,7 @@
                   <pic:spPr>
                     <a:xfrm>
                       <a:off x="0" y="0"/>
-                      <a:ext cx="5940000" cy="3638250"/>
+                      <a:ext cx="5940000" cy="3341250"/>
                     </a:xfrm>
                     <a:prstGeom prst="rect"/>
                   </pic:spPr>
@@ -99,7 +99,7 @@
     </w:p>
     <w:p>
       <w:pPr>
-        <w:spacing w:before="280" w:after="100"/>
+        <w:spacing w:before="260" w:after="80"/>
       </w:pPr>
       <w:r>
         <w:rPr>
@@ -121,7 +121,7 @@
           <w:rFonts w:ascii="微软雅黑" w:hAnsi="微软雅黑" w:eastAsia="微软雅黑"/>
           <w:sz w:val="21"/>
         </w:rPr>
-        <w:t>一台已安装 DSH 桌面端的电脑，DSH 能正常打开。</w:t>
+        <w:t>一台已安装 DSH 桌面端的 Windows 电脑。</w:t>
       </w:r>
     </w:p>
     <w:p>
@@ -139,19 +139,6 @@
     </w:p>
     <w:p>
       <w:pPr>
-        <w:pStyle w:val="ListBullet"/>
-        <w:spacing w:after="40"/>
-      </w:pPr>
-      <w:r>
-        <w:rPr>
-          <w:rFonts w:ascii="微软雅黑" w:hAnsi="微软雅黑" w:eastAsia="微软雅黑"/>
-          <w:sz w:val="21"/>
-        </w:rPr>
-        <w:t>知识空间、草稿库、出稿库和总结表已经统一配置，通常不需要改动。</w:t>
-      </w:r>
-    </w:p>
-    <w:p>
-      <w:pPr>
         <w:spacing w:after="60"/>
       </w:pPr>
       <w:r>
@@ -161,12 +148,12 @@
           <w:color w:val="B91C1C"/>
           <w:sz w:val="21"/>
         </w:rPr>
-        <w:t>appSecret 只放在本机配置文件里。不要写进安装包、仓库、聊天记录或群文件。</w:t>
+        <w:t>appSecret 只写入本机 DSH profile，不会上传。</w:t>
       </w:r>
     </w:p>
     <w:p>
       <w:pPr>
-        <w:spacing w:before="280" w:after="100"/>
+        <w:spacing w:before="260" w:after="80"/>
       </w:pPr>
       <w:r>
         <w:rPr>
@@ -175,7 +162,7 @@
           <w:color w:val="4B4BC8"/>
           <w:sz w:val="28"/>
         </w:rPr>
-        <w:t>二、获取并解压安装包</w:t>
+        <w:t>二、一键安装</w:t>
       </w:r>
     </w:p>
     <w:p>
@@ -188,7 +175,7 @@
           <w:b w:val="0"/>
           <w:sz w:val="21"/>
         </w:rPr>
-        <w:t>1. 打开 GitHub Release 页面：https://github.com/justinliuSD007/JSWJ_DraftbyDSH/releases</w:t>
+        <w:t>1. 下载安装器：JSWJ-Draft-Setup-0.6.26.exe。</w:t>
       </w:r>
     </w:p>
     <w:p>
@@ -201,7 +188,7 @@
           <w:b w:val="0"/>
           <w:sz w:val="21"/>
         </w:rPr>
-        <w:t>2. 下载最新安装包，文件名类似 jswj-draft-plugin-0.6.9.zip。</w:t>
+        <w:t>2. 完全退出 DSH（不是最小化，任务栏里也要退出）。</w:t>
       </w:r>
     </w:p>
     <w:p>
@@ -214,7 +201,7 @@
           <w:b w:val="0"/>
           <w:sz w:val="21"/>
         </w:rPr>
-        <w:t>3. 解压到一个固定目录，例如 D:\DSH\plugins\jswj-draft。</w:t>
+        <w:t>3. 双击安装器。</w:t>
       </w:r>
     </w:p>
     <w:p>
@@ -227,47 +214,7 @@
           <w:b w:val="0"/>
           <w:sz w:val="21"/>
         </w:rPr>
-        <w:t>4. 打开该目录，必须能看到 package.json。</w:t>
-      </w:r>
-    </w:p>
-    <w:p>
-      <w:pPr>
-        <w:spacing w:before="100" w:after="100"/>
-        <w:jc w:val="center"/>
-      </w:pPr>
-      <w:r>
-        <w:drawing>
-          <wp:inline xmlns:a="http://schemas.openxmlformats.org/drawingml/2006/main" xmlns:pic="http://schemas.openxmlformats.org/drawingml/2006/picture">
-            <wp:extent cx="5940000" cy="3564000"/>
-            <wp:docPr id="2" name="Picture 2"/>
-            <wp:cNvGraphicFramePr>
-              <a:graphicFrameLocks noChangeAspect="1"/>
-            </wp:cNvGraphicFramePr>
-            <a:graphic>
-              <a:graphicData uri="http://schemas.openxmlformats.org/drawingml/2006/picture">
-                <pic:pic>
-                  <pic:nvPicPr>
-                    <pic:cNvPr id="0" name="install-folder.png"/>
-                    <pic:cNvPicPr/>
-                  </pic:nvPicPr>
-                  <pic:blipFill>
-                    <a:blip r:embed="rId10"/>
-                    <a:stretch>
-                      <a:fillRect/>
-                    </a:stretch>
-                  </pic:blipFill>
-                  <pic:spPr>
-                    <a:xfrm>
-                      <a:off x="0" y="0"/>
-                      <a:ext cx="5940000" cy="3564000"/>
-                    </a:xfrm>
-                    <a:prstGeom prst="rect"/>
-                  </pic:spPr>
-                </pic:pic>
-              </a:graphicData>
-            </a:graphic>
-          </wp:inline>
-        </w:drawing>
+        <w:t>4. 按提示输入 GO秘 的 appId 和 appSecret。</w:t>
       </w:r>
     </w:p>
     <w:p>
@@ -280,21 +227,7 @@
           <w:b w:val="0"/>
           <w:sz w:val="21"/>
         </w:rPr>
-        <w:t>注意：不要直接在 zip 压缩包里运行；不要把解压出来的文件夹再套一层；不要放在系统临时目录。</w:t>
-      </w:r>
-    </w:p>
-    <w:p>
-      <w:pPr>
-        <w:spacing w:before="280" w:after="100"/>
-      </w:pPr>
-      <w:r>
-        <w:rPr>
-          <w:rFonts w:ascii="微软雅黑" w:hAnsi="微软雅黑" w:eastAsia="微软雅黑"/>
-          <w:b/>
-          <w:color w:val="4B4BC8"/>
-          <w:sz w:val="28"/>
-        </w:rPr>
-        <w:t>三、安装 Bundle</w:t>
+        <w:t>5. 等待安装器提示「安装完成」。</w:t>
       </w:r>
     </w:p>
     <w:p>
@@ -307,7 +240,21 @@
           <w:b w:val="0"/>
           <w:sz w:val="21"/>
         </w:rPr>
-        <w:t>1. 打开 DSH。</w:t>
+        <w:t>6. 重新打开 DSH。</w:t>
+      </w:r>
+    </w:p>
+    <w:p>
+      <w:pPr>
+        <w:spacing w:before="260" w:after="80"/>
+      </w:pPr>
+      <w:r>
+        <w:rPr>
+          <w:rFonts w:ascii="微软雅黑" w:hAnsi="微软雅黑" w:eastAsia="微软雅黑"/>
+          <w:b/>
+          <w:color w:val="4B4BC8"/>
+          <w:sz w:val="28"/>
+        </w:rPr>
+        <w:t>三、安装后确认</w:t>
       </w:r>
     </w:p>
     <w:p>
@@ -320,7 +267,7 @@
           <w:b w:val="0"/>
           <w:sz w:val="21"/>
         </w:rPr>
-        <w:t>2. 进入「插件管理」。</w:t>
+        <w:t>1. 左侧出现「技术文件起草」。</w:t>
       </w:r>
     </w:p>
     <w:p>
@@ -333,7 +280,7 @@
           <w:b w:val="0"/>
           <w:sz w:val="21"/>
         </w:rPr>
-        <w:t>3. 选择「安装本地 bundle」。</w:t>
+        <w:t>2. 打开页面，点「插件自检」。</w:t>
       </w:r>
     </w:p>
     <w:p>
@@ -346,7 +293,7 @@
           <w:b w:val="0"/>
           <w:sz w:val="21"/>
         </w:rPr>
-        <w:t>4. 选择刚才解压的 jswj-draft 目录，也就是包含 package.json 的那一层。</w:t>
+        <w:t>3. 全部通过后即可新建任务。</w:t>
       </w:r>
     </w:p>
     <w:p>
@@ -359,7 +306,21 @@
           <w:b w:val="0"/>
           <w:sz w:val="21"/>
         </w:rPr>
-        <w:t>5. 安装完成后启用插件，并重载 DSH。</w:t>
+        <w:t>如果自检报红，按提示检查 appId / appSecret，或重新运行安装器。</w:t>
+      </w:r>
+    </w:p>
+    <w:p>
+      <w:pPr>
+        <w:spacing w:before="260" w:after="80"/>
+      </w:pPr>
+      <w:r>
+        <w:rPr>
+          <w:rFonts w:ascii="微软雅黑" w:hAnsi="微软雅黑" w:eastAsia="微软雅黑"/>
+          <w:b/>
+          <w:color w:val="4B4BC8"/>
+          <w:sz w:val="28"/>
+        </w:rPr>
+        <w:t>四、手动安装（备用）</w:t>
       </w:r>
     </w:p>
     <w:p>
@@ -372,7 +333,7 @@
           <w:b w:val="0"/>
           <w:sz w:val="21"/>
         </w:rPr>
-        <w:t>安装成功后，左侧导航会出现「技术文件起草」。</w:t>
+        <w:t>如果安装器被安全软件拦截，或需要装到自定义目录：</w:t>
       </w:r>
     </w:p>
     <w:p>
@@ -385,36 +346,7 @@
           <w:b w:val="0"/>
           <w:sz w:val="21"/>
         </w:rPr>
-        <w:t>如果使用终端里的 DSH 助手，也可以直接说：</w:t>
-      </w:r>
-    </w:p>
-    <w:p>
-      <w:pPr>
-        <w:spacing w:before="60" w:after="100"/>
-        <w:ind w:left="227"/>
-        <w:shd w:val="clear" w:color="auto" w:fill="F3F4F8"/>
-      </w:pPr>
-      <w:r>
-        <w:rPr>
-          <w:rFonts w:ascii="Consolas" w:hAnsi="Consolas" w:eastAsia="Consolas"/>
-          <w:color w:val="252A3A"/>
-          <w:sz w:val="18"/>
-        </w:rPr>
-        <w:t>安装本地 bundle，路径是 D:\DSH\plugins\jswj-draft</w:t>
-      </w:r>
-    </w:p>
-    <w:p>
-      <w:pPr>
-        <w:spacing w:before="280" w:after="100"/>
-      </w:pPr>
-      <w:r>
-        <w:rPr>
-          <w:rFonts w:ascii="微软雅黑" w:hAnsi="微软雅黑" w:eastAsia="微软雅黑"/>
-          <w:b/>
-          <w:color w:val="4B4BC8"/>
-          <w:sz w:val="28"/>
-        </w:rPr>
-        <w:t>四、配置 GO秘 凭据</w:t>
+        <w:t>1. 下载 jswj-draft-plugin-0.6.26.zip 并解压到固定目录，确保目录内有 package.json。</w:t>
       </w:r>
     </w:p>
     <w:p>
@@ -427,7 +359,7 @@
           <w:b w:val="0"/>
           <w:sz w:val="21"/>
         </w:rPr>
-        <w:t>1. 先关闭 DSH，避免配置被覆盖。</w:t>
+        <w:t>2. 在 DSH 插件管理选择「安装本地 bundle」，指向该目录。</w:t>
       </w:r>
     </w:p>
     <w:p>
@@ -440,7 +372,7 @@
           <w:b w:val="0"/>
           <w:sz w:val="21"/>
         </w:rPr>
-        <w:t>2. 打开本机 profile 配置文件：%USERPROFILE%\.dsh\profiles\desktop\cordis.patch.yml</w:t>
+        <w:t>3. 在 profile 的 cordis.patch.yml 追加 jswj-draft 配置，填入 appId / appSecret。</w:t>
       </w:r>
     </w:p>
     <w:p>
@@ -453,36 +385,100 @@
           <w:b w:val="0"/>
           <w:sz w:val="21"/>
         </w:rPr>
-        <w:t>3. 在文件末尾追加下面的配置块：</w:t>
+        <w:t>4. 重载 DSH，打开「技术文件起草」做插件自检。</w:t>
       </w:r>
     </w:p>
     <w:p>
       <w:pPr>
-        <w:spacing w:before="60" w:after="100"/>
-        <w:ind w:left="227"/>
-        <w:shd w:val="clear" w:color="auto" w:fill="F3F4F8"/>
+        <w:spacing w:before="260" w:after="80"/>
       </w:pPr>
       <w:r>
         <w:rPr>
-          <w:rFonts w:ascii="Consolas" w:hAnsi="Consolas" w:eastAsia="Consolas"/>
-          <w:color w:val="252A3A"/>
-          <w:sz w:val="18"/>
+          <w:rFonts w:ascii="微软雅黑" w:hAnsi="微软雅黑" w:eastAsia="微软雅黑"/>
+          <w:b/>
+          <w:color w:val="4B4BC8"/>
+          <w:sz w:val="28"/>
         </w:rPr>
-        <w:t>- id: jswj-draft</w:t>
-        <w:br/>
-        <w:t xml:space="preserve">  config:</w:t>
-        <w:br/>
-        <w:t xml:space="preserve">    appId: "cli_xxxxxxxxxxxxxxxx"</w:t>
-        <w:br/>
-        <w:t xml:space="preserve">    appSecret: "xxxxxxxxxxxxxxxxxxxxxxxxxxxxxxxx"</w:t>
-        <w:br/>
-        <w:t xml:space="preserve">    spaceId: "7698962670346636559"</w:t>
-        <w:br/>
-        <w:t xml:space="preserve">    draftRootToken: "K3NpwxFzribxgOkzFxaczeH7nXf"</w:t>
-        <w:br/>
-        <w:t xml:space="preserve">    wikiBaseUrl: "https://govy.feishu.cn"</w:t>
-        <w:br/>
-        <w:t xml:space="preserve">    summaryWikiToken: "P77ZwJyDIiIfoJkmUVccrk7mnfc"</w:t>
+        <w:t>五、常见问题</w:t>
+      </w:r>
+    </w:p>
+    <w:p>
+      <w:pPr>
+        <w:pStyle w:val="ListBullet"/>
+        <w:spacing w:after="40"/>
+      </w:pPr>
+      <w:r>
+        <w:rPr>
+          <w:rFonts w:ascii="微软雅黑" w:hAnsi="微软雅黑" w:eastAsia="微软雅黑"/>
+          <w:sz w:val="21"/>
+        </w:rPr>
+        <w:t>双击安装器没反应：右键「以管理员身份运行」，或确认 DSH 已完全退出。</w:t>
+      </w:r>
+    </w:p>
+    <w:p>
+      <w:pPr>
+        <w:pStyle w:val="ListBullet"/>
+        <w:spacing w:after="40"/>
+      </w:pPr>
+      <w:r>
+        <w:rPr>
+          <w:rFonts w:ascii="微软雅黑" w:hAnsi="微软雅黑" w:eastAsia="微软雅黑"/>
+          <w:sz w:val="21"/>
+        </w:rPr>
+        <w:t>安装器提示找不到 profile：先启动一次 DSH，让它生成默认 profile。</w:t>
+      </w:r>
+    </w:p>
+    <w:p>
+      <w:pPr>
+        <w:pStyle w:val="ListBullet"/>
+        <w:spacing w:after="40"/>
+      </w:pPr>
+      <w:r>
+        <w:rPr>
+          <w:rFonts w:ascii="微软雅黑" w:hAnsi="微软雅黑" w:eastAsia="微软雅黑"/>
+          <w:sz w:val="21"/>
+        </w:rPr>
+        <w:t>左侧没有「技术文件起草」：确认 DSH 已重启，插件管理中 bundle 已启用。</w:t>
+      </w:r>
+    </w:p>
+    <w:p>
+      <w:pPr>
+        <w:pStyle w:val="ListBullet"/>
+        <w:spacing w:after="40"/>
+      </w:pPr>
+      <w:r>
+        <w:rPr>
+          <w:rFonts w:ascii="微软雅黑" w:hAnsi="微软雅黑" w:eastAsia="微软雅黑"/>
+          <w:sz w:val="21"/>
+        </w:rPr>
+        <w:t>自检报凭据错误：检查 GO秘 应用未停用，appId / appSecret 没有多余空格。</w:t>
+      </w:r>
+    </w:p>
+    <w:p>
+      <w:pPr>
+        <w:pStyle w:val="ListBullet"/>
+        <w:spacing w:after="40"/>
+      </w:pPr>
+      <w:r>
+        <w:rPr>
+          <w:rFonts w:ascii="微软雅黑" w:hAnsi="微软雅黑" w:eastAsia="微软雅黑"/>
+          <w:sz w:val="21"/>
+        </w:rPr>
+        <w:t>公司网络无法访问 GitHub：将安装器、插件包和索引放到公司内网，再用同样步骤安装。</w:t>
+      </w:r>
+    </w:p>
+    <w:p>
+      <w:pPr>
+        <w:spacing w:before="260" w:after="80"/>
+      </w:pPr>
+      <w:r>
+        <w:rPr>
+          <w:rFonts w:ascii="微软雅黑" w:hAnsi="微软雅黑" w:eastAsia="微软雅黑"/>
+          <w:b/>
+          <w:color w:val="4B4BC8"/>
+          <w:sz w:val="28"/>
+        </w:rPr>
+        <w:t>六、升级</w:t>
       </w:r>
     </w:p>
     <w:p>
@@ -495,430 +491,7 @@
           <w:b w:val="0"/>
           <w:sz w:val="21"/>
         </w:rPr>
-        <w:t>4. 只改 appId 和 appSecret，其他项保持预置值。</w:t>
-      </w:r>
-    </w:p>
-    <w:p>
-      <w:pPr>
-        <w:spacing w:after="60"/>
-      </w:pPr>
-      <w:r>
-        <w:rPr>
-          <w:rFonts w:ascii="微软雅黑" w:hAnsi="微软雅黑" w:eastAsia="微软雅黑"/>
-          <w:b w:val="0"/>
-          <w:sz w:val="21"/>
-        </w:rPr>
-        <w:t>5. 保存文件，重新打开 DSH。</w:t>
-      </w:r>
-    </w:p>
-    <w:p>
-      <w:pPr>
-        <w:spacing w:before="100" w:after="100"/>
-        <w:jc w:val="center"/>
-      </w:pPr>
-      <w:r>
-        <w:drawing>
-          <wp:inline xmlns:a="http://schemas.openxmlformats.org/drawingml/2006/main" xmlns:pic="http://schemas.openxmlformats.org/drawingml/2006/picture">
-            <wp:extent cx="5940000" cy="3564000"/>
-            <wp:docPr id="3" name="Picture 3"/>
-            <wp:cNvGraphicFramePr>
-              <a:graphicFrameLocks noChangeAspect="1"/>
-            </wp:cNvGraphicFramePr>
-            <a:graphic>
-              <a:graphicData uri="http://schemas.openxmlformats.org/drawingml/2006/picture">
-                <pic:pic>
-                  <pic:nvPicPr>
-                    <pic:cNvPr id="0" name="install-config.png"/>
-                    <pic:cNvPicPr/>
-                  </pic:nvPicPr>
-                  <pic:blipFill>
-                    <a:blip r:embed="rId11"/>
-                    <a:stretch>
-                      <a:fillRect/>
-                    </a:stretch>
-                  </pic:blipFill>
-                  <pic:spPr>
-                    <a:xfrm>
-                      <a:off x="0" y="0"/>
-                      <a:ext cx="5940000" cy="3564000"/>
-                    </a:xfrm>
-                    <a:prstGeom prst="rect"/>
-                  </pic:spPr>
-                </pic:pic>
-              </a:graphicData>
-            </a:graphic>
-          </wp:inline>
-        </w:drawing>
-      </w:r>
-    </w:p>
-    <w:p>
-      <w:pPr>
-        <w:spacing w:after="60"/>
-      </w:pPr>
-      <w:r>
-        <w:rPr>
-          <w:rFonts w:ascii="微软雅黑" w:hAnsi="微软雅黑" w:eastAsia="微软雅黑"/>
-          <w:b w:val="0"/>
-          <w:sz w:val="21"/>
-        </w:rPr>
-        <w:t>如果 profile 里已经有 - id: jswj-draft 段，只改其中的 appId / appSecret，不要重复追加。appId / appSecret 不要带多余空格，也不要填 DSH 账号密码。</w:t>
-      </w:r>
-    </w:p>
-    <w:p>
-      <w:pPr>
-        <w:spacing w:before="280" w:after="100"/>
-      </w:pPr>
-      <w:r>
-        <w:rPr>
-          <w:rFonts w:ascii="微软雅黑" w:hAnsi="微软雅黑" w:eastAsia="微软雅黑"/>
-          <w:b/>
-          <w:color w:val="4B4BC8"/>
-          <w:sz w:val="28"/>
-        </w:rPr>
-        <w:t>五、插件自检</w:t>
-      </w:r>
-    </w:p>
-    <w:p>
-      <w:pPr>
-        <w:spacing w:after="60"/>
-      </w:pPr>
-      <w:r>
-        <w:rPr>
-          <w:rFonts w:ascii="微软雅黑" w:hAnsi="微软雅黑" w:eastAsia="微软雅黑"/>
-          <w:b w:val="0"/>
-          <w:sz w:val="21"/>
-        </w:rPr>
-        <w:t>1. 打开左侧「技术文件起草」。</w:t>
-      </w:r>
-    </w:p>
-    <w:p>
-      <w:pPr>
-        <w:spacing w:after="60"/>
-      </w:pPr>
-      <w:r>
-        <w:rPr>
-          <w:rFonts w:ascii="微软雅黑" w:hAnsi="微软雅黑" w:eastAsia="微软雅黑"/>
-          <w:b w:val="0"/>
-          <w:sz w:val="21"/>
-        </w:rPr>
-        <w:t>2. 首页顶部应显示绿色「插件自检通过」。</w:t>
-      </w:r>
-    </w:p>
-    <w:p>
-      <w:pPr>
-        <w:spacing w:after="60"/>
-      </w:pPr>
-      <w:r>
-        <w:rPr>
-          <w:rFonts w:ascii="微软雅黑" w:hAnsi="微软雅黑" w:eastAsia="微软雅黑"/>
-          <w:b w:val="0"/>
-          <w:sz w:val="21"/>
-        </w:rPr>
-        <w:t>3. 如果显示红色，按提示补 appId / appSecret，或重载 DSH 后再试。</w:t>
-      </w:r>
-    </w:p>
-    <w:p>
-      <w:pPr>
-        <w:spacing w:before="100" w:after="100"/>
-        <w:jc w:val="center"/>
-      </w:pPr>
-      <w:r>
-        <w:drawing>
-          <wp:inline xmlns:a="http://schemas.openxmlformats.org/drawingml/2006/main" xmlns:pic="http://schemas.openxmlformats.org/drawingml/2006/picture">
-            <wp:extent cx="5940000" cy="3405600"/>
-            <wp:docPr id="4" name="Picture 4"/>
-            <wp:cNvGraphicFramePr>
-              <a:graphicFrameLocks noChangeAspect="1"/>
-            </wp:cNvGraphicFramePr>
-            <a:graphic>
-              <a:graphicData uri="http://schemas.openxmlformats.org/drawingml/2006/picture">
-                <pic:pic>
-                  <pic:nvPicPr>
-                    <pic:cNvPr id="0" name="install-check.png"/>
-                    <pic:cNvPicPr/>
-                  </pic:nvPicPr>
-                  <pic:blipFill>
-                    <a:blip r:embed="rId12"/>
-                    <a:stretch>
-                      <a:fillRect/>
-                    </a:stretch>
-                  </pic:blipFill>
-                  <pic:spPr>
-                    <a:xfrm>
-                      <a:off x="0" y="0"/>
-                      <a:ext cx="5940000" cy="3405600"/>
-                    </a:xfrm>
-                    <a:prstGeom prst="rect"/>
-                  </pic:spPr>
-                </pic:pic>
-              </a:graphicData>
-            </a:graphic>
-          </wp:inline>
-        </w:drawing>
-      </w:r>
-    </w:p>
-    <w:p>
-      <w:pPr>
-        <w:spacing w:after="60"/>
-      </w:pPr>
-      <w:r>
-        <w:rPr>
-          <w:rFonts w:ascii="微软雅黑" w:hAnsi="微软雅黑" w:eastAsia="微软雅黑"/>
-          <w:b w:val="0"/>
-          <w:sz w:val="21"/>
-        </w:rPr>
-        <w:t>自检会检查：飞书应用 GO秘、知识空间与草稿库、GY-F003 模板、Python 运行时、配套 Skill jswj-draftbydsh。</w:t>
-      </w:r>
-    </w:p>
-    <w:p>
-      <w:pPr>
-        <w:spacing w:after="60"/>
-      </w:pPr>
-      <w:r>
-        <w:rPr>
-          <w:rFonts w:ascii="微软雅黑" w:hAnsi="微软雅黑" w:eastAsia="微软雅黑"/>
-          <w:b w:val="0"/>
-          <w:sz w:val="21"/>
-        </w:rPr>
-        <w:t>自检通过后，就可以新建任务，按 7 步流程起草：基本信息 → 文档属性 → 参考资料 → 大纲与纲要 → 生成 → 成稿确认 → 出稿。</w:t>
-      </w:r>
-    </w:p>
-    <w:p>
-      <w:pPr>
-        <w:spacing w:before="280" w:after="100"/>
-      </w:pPr>
-      <w:r>
-        <w:rPr>
-          <w:rFonts w:ascii="微软雅黑" w:hAnsi="微软雅黑" w:eastAsia="微软雅黑"/>
-          <w:b/>
-          <w:color w:val="4B4BC8"/>
-          <w:sz w:val="28"/>
-        </w:rPr>
-        <w:t>六、目录约定</w:t>
-      </w:r>
-    </w:p>
-    <w:p>
-      <w:pPr>
-        <w:pStyle w:val="ListBullet"/>
-        <w:spacing w:after="40"/>
-      </w:pPr>
-      <w:r>
-        <w:rPr>
-          <w:rFonts w:ascii="微软雅黑" w:hAnsi="微软雅黑" w:eastAsia="微软雅黑"/>
-          <w:sz w:val="21"/>
-        </w:rPr>
-        <w:t>草稿与预览：技术资料草稿库 / 层级 / 板块 / 文件类型 /</w:t>
-      </w:r>
-    </w:p>
-    <w:p>
-      <w:pPr>
-        <w:pStyle w:val="ListBullet"/>
-        <w:spacing w:after="40"/>
-      </w:pPr>
-      <w:r>
-        <w:rPr>
-          <w:rFonts w:ascii="微软雅黑" w:hAnsi="微软雅黑" w:eastAsia="微软雅黑"/>
-          <w:sz w:val="21"/>
-        </w:rPr>
-        <w:t>正式出稿（飞书审批）：技术资料出稿库 / 飞书审批 / 层级 / 板块 /</w:t>
-      </w:r>
-    </w:p>
-    <w:p>
-      <w:pPr>
-        <w:pStyle w:val="ListBullet"/>
-        <w:spacing w:after="40"/>
-      </w:pPr>
-      <w:r>
-        <w:rPr>
-          <w:rFonts w:ascii="微软雅黑" w:hAnsi="微软雅黑" w:eastAsia="微软雅黑"/>
-          <w:sz w:val="21"/>
-        </w:rPr>
-        <w:t>正式出稿（Polarion）：技术资料出稿库 / Polarion / 项目空间 /</w:t>
-      </w:r>
-    </w:p>
-    <w:p>
-      <w:pPr>
-        <w:pStyle w:val="ListBullet"/>
-        <w:spacing w:after="40"/>
-      </w:pPr>
-      <w:r>
-        <w:rPr>
-          <w:rFonts w:ascii="微软雅黑" w:hAnsi="微软雅黑" w:eastAsia="微软雅黑"/>
-          <w:sz w:val="21"/>
-        </w:rPr>
-        <w:t>参考资料：参考资料库 / 层级 / 板块 /</w:t>
-      </w:r>
-    </w:p>
-    <w:p>
-      <w:pPr>
-        <w:spacing w:before="280" w:after="100"/>
-      </w:pPr>
-      <w:r>
-        <w:rPr>
-          <w:rFonts w:ascii="微软雅黑" w:hAnsi="微软雅黑" w:eastAsia="微软雅黑"/>
-          <w:b/>
-          <w:color w:val="4B4BC8"/>
-          <w:sz w:val="28"/>
-        </w:rPr>
-        <w:t>七、升级与卸载</w:t>
-      </w:r>
-    </w:p>
-    <w:p>
-      <w:pPr>
-        <w:spacing w:after="60"/>
-      </w:pPr>
-      <w:r>
-        <w:rPr>
-          <w:rFonts w:ascii="微软雅黑" w:hAnsi="微软雅黑" w:eastAsia="微软雅黑"/>
-          <w:b w:val="0"/>
-          <w:sz w:val="21"/>
-        </w:rPr>
-        <w:t>升级：下载新版本 zip → 用插件管理覆盖安装到原目录 → 重载 DSH。任务数据保存在 ~/.dsh/jswj-tasks，升级不会丢失。</w:t>
-      </w:r>
-    </w:p>
-    <w:p>
-      <w:pPr>
-        <w:spacing w:after="60"/>
-      </w:pPr>
-      <w:r>
-        <w:rPr>
-          <w:rFonts w:ascii="微软雅黑" w:hAnsi="微软雅黑" w:eastAsia="微软雅黑"/>
-          <w:b w:val="0"/>
-          <w:sz w:val="21"/>
-        </w:rPr>
-        <w:t>卸载：在插件管理中停用或移除 bundle；是否删除 ~/.dsh/skills/jswj-draftbydsh 和任务数据由你决定。</w:t>
-      </w:r>
-    </w:p>
-    <w:p>
-      <w:pPr>
-        <w:spacing w:before="280" w:after="100"/>
-      </w:pPr>
-      <w:r>
-        <w:rPr>
-          <w:rFonts w:ascii="微软雅黑" w:hAnsi="微软雅黑" w:eastAsia="微软雅黑"/>
-          <w:b/>
-          <w:color w:val="4B4BC8"/>
-          <w:sz w:val="28"/>
-        </w:rPr>
-        <w:t>八、常见问题</w:t>
-      </w:r>
-    </w:p>
-    <w:p>
-      <w:pPr>
-        <w:pStyle w:val="ListBullet"/>
-        <w:spacing w:after="40"/>
-      </w:pPr>
-      <w:r>
-        <w:rPr>
-          <w:rFonts w:ascii="微软雅黑" w:hAnsi="微软雅黑" w:eastAsia="微软雅黑"/>
-          <w:sz w:val="21"/>
-        </w:rPr>
-        <w:t>左侧没有「技术文件起草」：确认 bundle 已启用，并重载 DSH。</w:t>
-      </w:r>
-    </w:p>
-    <w:p>
-      <w:pPr>
-        <w:pStyle w:val="ListBullet"/>
-        <w:spacing w:after="40"/>
-      </w:pPr>
-      <w:r>
-        <w:rPr>
-          <w:rFonts w:ascii="微软雅黑" w:hAnsi="微软雅黑" w:eastAsia="微软雅黑"/>
-          <w:sz w:val="21"/>
-        </w:rPr>
-        <w:t>自检报凭据错误：检查「GO秘」的 appId / appSecret，确认应用未停用。</w:t>
-      </w:r>
-    </w:p>
-    <w:p>
-      <w:pPr>
-        <w:pStyle w:val="ListBullet"/>
-        <w:spacing w:after="40"/>
-      </w:pPr>
-      <w:r>
-        <w:rPr>
-          <w:rFonts w:ascii="微软雅黑" w:hAnsi="微软雅黑" w:eastAsia="微软雅黑"/>
-          <w:sz w:val="21"/>
-        </w:rPr>
-        <w:t>检查更新失败：仓库已公开，通常为网络无法访问 GitHub；不影响起草和出稿。</w:t>
-      </w:r>
-    </w:p>
-    <w:p>
-      <w:pPr>
-        <w:pStyle w:val="ListBullet"/>
-        <w:spacing w:after="40"/>
-      </w:pPr>
-      <w:r>
-        <w:rPr>
-          <w:rFonts w:ascii="微软雅黑" w:hAnsi="微软雅黑" w:eastAsia="微软雅黑"/>
-          <w:sz w:val="21"/>
-        </w:rPr>
-        <w:t>上传提示 20 MB 限制：压缩图片或拆分文件。</w:t>
-      </w:r>
-    </w:p>
-    <w:p>
-      <w:pPr>
-        <w:pStyle w:val="ListBullet"/>
-        <w:spacing w:after="40"/>
-      </w:pPr>
-      <w:r>
-        <w:rPr>
-          <w:rFonts w:ascii="微软雅黑" w:hAnsi="微软雅黑" w:eastAsia="微软雅黑"/>
-          <w:sz w:val="21"/>
-        </w:rPr>
-        <w:t>页面提示字体缺失：安装 HarmonyOS Sans SC；字体有授权限制，不随安装包分发。</w:t>
-      </w:r>
-    </w:p>
-    <w:p>
-      <w:pPr>
-        <w:pStyle w:val="ListBullet"/>
-        <w:spacing w:after="40"/>
-      </w:pPr>
-      <w:r>
-        <w:rPr>
-          <w:rFonts w:ascii="微软雅黑" w:hAnsi="微软雅黑" w:eastAsia="微软雅黑"/>
-          <w:sz w:val="21"/>
-        </w:rPr>
-        <w:t>出稿库没有文件：确认第 2 步归档位置选的是飞书审批或 Polarion。</w:t>
-      </w:r>
-    </w:p>
-    <w:p>
-      <w:pPr>
-        <w:pStyle w:val="ListBullet"/>
-        <w:spacing w:after="40"/>
-      </w:pPr>
-      <w:r>
-        <w:rPr>
-          <w:rFonts w:ascii="微软雅黑" w:hAnsi="微软雅黑" w:eastAsia="微软雅黑"/>
-          <w:sz w:val="21"/>
-        </w:rPr>
-        <w:t>任务总结没有写入多维表格：检查 summaryWikiToken 配置。</w:t>
-      </w:r>
-    </w:p>
-    <w:p>
-      <w:pPr>
-        <w:spacing w:before="280" w:after="100"/>
-      </w:pPr>
-      <w:r>
-        <w:rPr>
-          <w:rFonts w:ascii="微软雅黑" w:hAnsi="微软雅黑" w:eastAsia="微软雅黑"/>
-          <w:b/>
-          <w:color w:val="4B4BC8"/>
-          <w:sz w:val="28"/>
-        </w:rPr>
-        <w:t>九、安全要求</w:t>
-      </w:r>
-    </w:p>
-    <w:p>
-      <w:pPr>
-        <w:spacing w:after="60"/>
-      </w:pPr>
-      <w:r>
-        <w:rPr>
-          <w:rFonts w:ascii="微软雅黑" w:hAnsi="微软雅黑" w:eastAsia="微软雅黑"/>
-          <w:b w:val="0"/>
-          <w:sz w:val="21"/>
-        </w:rPr>
-        <w:t>appSecret 只放在本机 profile 配置里。不要把 profile 文件、安装包或截图中的 Secret 发到群里。安装包和仓库里不保存任何真实凭据。</w:t>
+        <w:t>下载新版安装器或新版 zip，重复安装即可覆盖旧版本；任务数据保存在 ~/.dsh/jswj-tasks，不会丢失。</w:t>
       </w:r>
     </w:p>
     <w:sectPr>

</xml_diff>

<commit_message>
release: 0.7.0-beta.1 first beta
</commit_message>
<xml_diff>
--- a/plugin/INSTALL.docx
+++ b/plugin/INSTALL.docx
@@ -41,7 +41,7 @@
           <w:color w:val="6B7280"/>
           <w:sz w:val="21"/>
         </w:rPr>
-        <w:t>适用版本：0.6.26　｜　约 2 分钟</w:t>
+        <w:t>适用版本：0.7.0-beta.1　｜　约 2 分钟</w:t>
       </w:r>
     </w:p>
     <w:p>
@@ -175,7 +175,7 @@
           <w:b w:val="0"/>
           <w:sz w:val="21"/>
         </w:rPr>
-        <w:t>1. 下载安装器：JSWJ-Draft-Setup-0.6.26.exe。</w:t>
+        <w:t>1. 下载安装器：JSWJ-Draft-Setup-0.7.0-beta.1.exe。</w:t>
       </w:r>
     </w:p>
     <w:p>
@@ -346,7 +346,7 @@
           <w:b w:val="0"/>
           <w:sz w:val="21"/>
         </w:rPr>
-        <w:t>1. 下载 jswj-draft-plugin-0.6.26.zip 并解压到固定目录，确保目录内有 package.json。</w:t>
+        <w:t>1. 下载 jswj-draft-plugin-0.7.0-beta.1.zip 并解压到固定目录，确保目录内有 package.json。</w:t>
       </w:r>
     </w:p>
     <w:p>

</xml_diff>

<commit_message>
release: 0.7.0-beta.2 with fixed one-click installer and detailed guide
</commit_message>
<xml_diff>
--- a/plugin/INSTALL.docx
+++ b/plugin/INSTALL.docx
@@ -27,7 +27,7 @@
           <w:color w:val="1E2433"/>
           <w:sz w:val="21"/>
         </w:rPr>
-        <w:t>适用版本：0.7.0-beta.1 ｜ 一键安装 ｜ 约 2 分钟</w:t>
+        <w:t>适用版本：0.7.0-beta.2 ｜ 一键安装 ｜ 约 2 分钟</w:t>
       </w:r>
     </w:p>
     <w:p>
@@ -249,7 +249,7 @@
           <w:color w:val="1E2433"/>
           <w:sz w:val="21"/>
         </w:rPr>
-        <w:t>安装器文件：JSWJ-Draft-Setup-0.7.0-beta.1.exe。</w:t>
+        <w:t>安装器文件：JSWJ-Draft-Setup-0.7.0-beta.2.exe。</w:t>
       </w:r>
     </w:p>
     <w:p>
@@ -404,7 +404,7 @@
           <w:color w:val="252A3A"/>
           <w:sz w:val="17"/>
         </w:rPr>
-        <w:t>JSWJ-Draft-Setup-0.7.0-beta.1.exe</w:t>
+        <w:t>JSWJ-Draft-Setup-0.7.0-beta.2.exe</w:t>
       </w:r>
     </w:p>
     <w:p>
@@ -433,7 +433,7 @@
           <w:color w:val="1E2433"/>
           <w:sz w:val="21"/>
         </w:rPr>
-        <w:t>文件名是 JSWJ-Draft-Setup-0.7.0-beta.1.exe</w:t>
+        <w:t>文件名是 JSWJ-Draft-Setup-0.7.0-beta.2.exe</w:t>
       </w:r>
     </w:p>
     <w:p>
@@ -477,7 +477,7 @@
           <w:color w:val="1E2433"/>
           <w:sz w:val="21"/>
         </w:rPr>
-        <w:t>如果下载到的是 jswj-draft-plugin-0.7.0-beta.1.zip，那是手动安装包，不是一键安装器。</w:t>
+        <w:t>如果下载到的是 jswj-draft-plugin-0.7.0-beta.2.zip，那是手动安装包，不是一键安装器。</w:t>
       </w:r>
     </w:p>
     <w:p>
@@ -652,7 +652,7 @@
           <w:color w:val="252A3A"/>
           <w:sz w:val="17"/>
         </w:rPr>
-        <w:t>JSWJ-Draft-Setup-0.7.0-beta.1.exe</w:t>
+        <w:t>JSWJ-Draft-Setup-0.7.0-beta.2.exe</w:t>
       </w:r>
     </w:p>
     <w:p>
@@ -926,7 +926,7 @@
           <w:color w:val="1E2433"/>
           <w:sz w:val="21"/>
         </w:rPr>
-        <w:t>重新下载 JSWJ-Draft-Setup-0.7.0-beta.1.exe</w:t>
+        <w:t>重新下载 JSWJ-Draft-Setup-0.7.0-beta.2.exe</w:t>
       </w:r>
     </w:p>
     <w:p>
@@ -970,9 +970,9 @@
           <w:color w:val="252A3A"/>
           <w:sz w:val="17"/>
         </w:rPr>
-        <w:t>技术文件起草插件 0.7.0 Beta 1 安装</w:t>
+        <w:t>技术文件起草插件 0.7.0 Beta 2 安装</w:t>
         <w:br/>
-        <w:t>安装技术文件起草（JSWJ_DraftbyDSH）0.7.0 Beta 1？</w:t>
+        <w:t>安装技术文件起草（JSWJ_DraftbyDSH）0.7.0 Beta 2？</w:t>
       </w:r>
     </w:p>
     <w:p>
@@ -2253,7 +2253,7 @@
                 <w:color w:val="1E2433"/>
                 <w:sz w:val="16"/>
               </w:rPr>
-              <w:t>下载 JSWJ-Draft-Setup-0.7.0-beta.1.exe</w:t>
+              <w:t>下载 JSWJ-Draft-Setup-0.7.0-beta.2.exe</w:t>
             </w:r>
           </w:p>
         </w:tc>
@@ -3066,7 +3066,7 @@
           <w:color w:val="1E2433"/>
           <w:sz w:val="21"/>
         </w:rPr>
-        <w:t>重新下载 JSWJ-Draft-Setup-0.7.0-beta.1.exe</w:t>
+        <w:t>重新下载 JSWJ-Draft-Setup-0.7.0-beta.2.exe</w:t>
       </w:r>
     </w:p>
     <w:p>
@@ -4477,7 +4477,7 @@
           <w:color w:val="252A3A"/>
           <w:sz w:val="17"/>
         </w:rPr>
-        <w:t>jswj-draft-plugin-0.7.0-beta.1.zip</w:t>
+        <w:t>jswj-draft-plugin-0.7.0-beta.2.zip</w:t>
       </w:r>
     </w:p>
     <w:p>

</xml_diff>